<commit_message>
Regenerate the Word handbook with the prototype measurement
Adds section 5.4a and the amended open-questions entry: the collapse is now
measured (35.7 to 25 degrees when grounding both ensembles, 41.9 when grounding
the normal one alone), while the direction of that collapse remains unmeasured
and is named as what the account still lacks.
</commit_message>
<xml_diff>
--- a/docs/08_understanding/DA-ZVAD_Handbook.docx
+++ b/docs/08_understanding/DA-ZVAD_Handbook.docx
@@ -4841,6 +4841,576 @@
     <w:p>
       <w:pPr>
         <w:keepNext/>
+        <w:spacing w:before="240" w:after="120"/>
+      </w:pPr>
+      <w:r>
+        <w:rPr>
+          <w:rFonts w:ascii="Segoe UI" w:hAnsi="Segoe UI"/>
+          <w:b/>
+          <w:color w:val="141C1E"/>
+          <w:sz w:val="25"/>
+        </w:rPr>
+        <w:t>5.4a — and we measured it</w:t>
+      </w:r>
+    </w:p>
+    <w:p>
+      <w:r>
+        <w:rPr>
+          <w:rFonts w:ascii="Georgia" w:hAnsi="Georgia"/>
+          <w:b w:val="0"/>
+          <w:i w:val="0"/>
+          <w:color w:val="3A4A4C"/>
+          <w:sz w:val="21"/>
+        </w:rPr>
+        <w:t>The prototypes are just averaged sentence embeddings, so the angle between them can be computed directly — no images needed, seconds to run.</w:t>
+      </w:r>
+    </w:p>
+    <w:tbl>
+      <w:tblPr>
+        <w:tblStyle w:val="TableGrid"/>
+        <w:tblW w:type="auto" w:w="0"/>
+        <w:jc w:val="left"/>
+        <w:tblLook w:firstColumn="1" w:firstRow="1" w:lastColumn="0" w:lastRow="0" w:noHBand="0" w:noVBand="1" w:val="04A0"/>
+      </w:tblPr>
+      <w:tblGrid>
+        <w:gridCol w:w="1863"/>
+        <w:gridCol w:w="1863"/>
+        <w:gridCol w:w="1863"/>
+        <w:gridCol w:w="1863"/>
+        <w:gridCol w:w="1863"/>
+      </w:tblGrid>
+      <w:tr>
+        <w:tc>
+          <w:tcPr>
+            <w:tcW w:type="dxa" w:w="1863"/>
+            <w:shd w:val="clear" w:fill="141C1E"/>
+          </w:tcPr>
+          <w:p>
+            <w:pPr>
+              <w:spacing w:before="60" w:after="60"/>
+            </w:pPr>
+            <w:r/>
+            <w:r>
+              <w:rPr>
+                <w:rFonts w:ascii="Segoe UI" w:hAnsi="Segoe UI"/>
+                <w:b/>
+                <w:i w:val="0"/>
+                <w:color w:val="FFFFFF"/>
+                <w:sz w:val="17"/>
+              </w:rPr>
+              <w:t>Fusion</w:t>
+            </w:r>
+          </w:p>
+        </w:tc>
+        <w:tc>
+          <w:tcPr>
+            <w:tcW w:type="dxa" w:w="1863"/>
+            <w:shd w:val="clear" w:fill="141C1E"/>
+          </w:tcPr>
+          <w:p>
+            <w:pPr>
+              <w:spacing w:before="60" w:after="60"/>
+            </w:pPr>
+            <w:r/>
+            <w:r>
+              <w:rPr>
+                <w:rFonts w:ascii="Segoe UI" w:hAnsi="Segoe UI"/>
+                <w:b/>
+                <w:i w:val="0"/>
+                <w:color w:val="FFFFFF"/>
+                <w:sz w:val="17"/>
+              </w:rPr>
+              <w:t>none</w:t>
+            </w:r>
+          </w:p>
+        </w:tc>
+        <w:tc>
+          <w:tcPr>
+            <w:tcW w:type="dxa" w:w="1863"/>
+            <w:shd w:val="clear" w:fill="141C1E"/>
+          </w:tcPr>
+          <w:p>
+            <w:pPr>
+              <w:spacing w:before="60" w:after="60"/>
+            </w:pPr>
+            <w:r/>
+            <w:r>
+              <w:rPr>
+                <w:rFonts w:ascii="Segoe UI" w:hAnsi="Segoe UI"/>
+                <w:b/>
+                <w:i w:val="0"/>
+                <w:color w:val="FFFFFF"/>
+                <w:sz w:val="17"/>
+              </w:rPr>
+              <w:t>generic</w:t>
+            </w:r>
+          </w:p>
+        </w:tc>
+        <w:tc>
+          <w:tcPr>
+            <w:tcW w:type="dxa" w:w="1863"/>
+            <w:shd w:val="clear" w:fill="141C1E"/>
+          </w:tcPr>
+          <w:p>
+            <w:pPr>
+              <w:spacing w:before="60" w:after="60"/>
+            </w:pPr>
+            <w:r/>
+            <w:r>
+              <w:rPr>
+                <w:rFonts w:ascii="Segoe UI" w:hAnsi="Segoe UI"/>
+                <w:b/>
+                <w:i w:val="0"/>
+                <w:color w:val="FFFFFF"/>
+                <w:sz w:val="17"/>
+              </w:rPr>
+              <w:t>matched</w:t>
+            </w:r>
+          </w:p>
+        </w:tc>
+        <w:tc>
+          <w:tcPr>
+            <w:tcW w:type="dxa" w:w="1863"/>
+            <w:shd w:val="clear" w:fill="141C1E"/>
+          </w:tcPr>
+          <w:p>
+            <w:pPr>
+              <w:spacing w:before="60" w:after="60"/>
+            </w:pPr>
+            <w:r/>
+            <w:r>
+              <w:rPr>
+                <w:rFonts w:ascii="Segoe UI" w:hAnsi="Segoe UI"/>
+                <w:b/>
+                <w:i w:val="0"/>
+                <w:color w:val="FFFFFF"/>
+                <w:sz w:val="17"/>
+              </w:rPr>
+              <w:t>mismatched</w:t>
+            </w:r>
+          </w:p>
+        </w:tc>
+      </w:tr>
+      <w:tr>
+        <w:tc>
+          <w:tcPr>
+            <w:tcW w:type="dxa" w:w="1863"/>
+            <w:shd w:val="clear" w:fill="DDEDEB"/>
+          </w:tcPr>
+          <w:p>
+            <w:pPr>
+              <w:spacing w:before="60" w:after="60"/>
+            </w:pPr>
+            <w:r/>
+            <w:r>
+              <w:rPr>
+                <w:rFonts w:ascii="Segoe UI" w:hAnsi="Segoe UI"/>
+                <w:b/>
+                <w:i w:val="0"/>
+                <w:color w:val="141C1E"/>
+                <w:sz w:val="18"/>
+              </w:rPr>
+              <w:t>Both ensembles</w:t>
+            </w:r>
+          </w:p>
+        </w:tc>
+        <w:tc>
+          <w:tcPr>
+            <w:tcW w:type="dxa" w:w="1863"/>
+            <w:shd w:val="clear" w:fill="F5F7F7"/>
+          </w:tcPr>
+          <w:p>
+            <w:pPr>
+              <w:spacing w:before="60" w:after="60"/>
+            </w:pPr>
+            <w:r/>
+            <w:r>
+              <w:rPr>
+                <w:rFonts w:ascii="Segoe UI" w:hAnsi="Segoe UI"/>
+                <w:b w:val="0"/>
+                <w:i w:val="0"/>
+                <w:color w:val="3A4A4C"/>
+                <w:sz w:val="18"/>
+              </w:rPr>
+              <w:t>35.7°</w:t>
+            </w:r>
+          </w:p>
+        </w:tc>
+        <w:tc>
+          <w:tcPr>
+            <w:tcW w:type="dxa" w:w="1863"/>
+            <w:shd w:val="clear" w:fill="F5F7F7"/>
+          </w:tcPr>
+          <w:p>
+            <w:pPr>
+              <w:spacing w:before="60" w:after="60"/>
+            </w:pPr>
+            <w:r/>
+            <w:r>
+              <w:rPr>
+                <w:rFonts w:ascii="Segoe UI" w:hAnsi="Segoe UI"/>
+                <w:b w:val="0"/>
+                <w:i w:val="0"/>
+                <w:color w:val="3A4A4C"/>
+                <w:sz w:val="18"/>
+              </w:rPr>
+              <w:t>26.3°</w:t>
+            </w:r>
+          </w:p>
+        </w:tc>
+        <w:tc>
+          <w:tcPr>
+            <w:tcW w:type="dxa" w:w="1863"/>
+            <w:shd w:val="clear" w:fill="F5F7F7"/>
+          </w:tcPr>
+          <w:p>
+            <w:pPr>
+              <w:spacing w:before="60" w:after="60"/>
+            </w:pPr>
+            <w:r/>
+            <w:r>
+              <w:rPr>
+                <w:rFonts w:ascii="Segoe UI" w:hAnsi="Segoe UI"/>
+                <w:b w:val="0"/>
+                <w:i w:val="0"/>
+                <w:color w:val="3A4A4C"/>
+                <w:sz w:val="18"/>
+              </w:rPr>
+              <w:t>26.3°</w:t>
+            </w:r>
+          </w:p>
+        </w:tc>
+        <w:tc>
+          <w:tcPr>
+            <w:tcW w:type="dxa" w:w="1863"/>
+            <w:shd w:val="clear" w:fill="F5F7F7"/>
+          </w:tcPr>
+          <w:p>
+            <w:pPr>
+              <w:spacing w:before="60" w:after="60"/>
+            </w:pPr>
+            <w:r/>
+            <w:r>
+              <w:rPr>
+                <w:rFonts w:ascii="Segoe UI" w:hAnsi="Segoe UI"/>
+                <w:b w:val="0"/>
+                <w:i w:val="0"/>
+                <w:color w:val="3A4A4C"/>
+                <w:sz w:val="18"/>
+              </w:rPr>
+              <w:t>25.0°</w:t>
+            </w:r>
+          </w:p>
+        </w:tc>
+      </w:tr>
+      <w:tr>
+        <w:tc>
+          <w:tcPr>
+            <w:tcW w:type="dxa" w:w="1863"/>
+            <w:shd w:val="clear" w:fill="DDEDEB"/>
+          </w:tcPr>
+          <w:p>
+            <w:pPr>
+              <w:spacing w:before="60" w:after="60"/>
+            </w:pPr>
+            <w:r/>
+            <w:r>
+              <w:rPr>
+                <w:rFonts w:ascii="Segoe UI" w:hAnsi="Segoe UI"/>
+                <w:b/>
+                <w:i w:val="0"/>
+                <w:color w:val="141C1E"/>
+                <w:sz w:val="18"/>
+              </w:rPr>
+              <w:t>Normal only</w:t>
+            </w:r>
+          </w:p>
+        </w:tc>
+        <w:tc>
+          <w:tcPr>
+            <w:tcW w:type="dxa" w:w="1863"/>
+            <w:shd w:val="clear" w:fill="FFFFFF"/>
+          </w:tcPr>
+          <w:p>
+            <w:pPr>
+              <w:spacing w:before="60" w:after="60"/>
+            </w:pPr>
+            <w:r/>
+            <w:r>
+              <w:rPr>
+                <w:rFonts w:ascii="Segoe UI" w:hAnsi="Segoe UI"/>
+                <w:b w:val="0"/>
+                <w:i w:val="0"/>
+                <w:color w:val="3A4A4C"/>
+                <w:sz w:val="18"/>
+              </w:rPr>
+              <w:t>35.7°</w:t>
+            </w:r>
+          </w:p>
+        </w:tc>
+        <w:tc>
+          <w:tcPr>
+            <w:tcW w:type="dxa" w:w="1863"/>
+            <w:shd w:val="clear" w:fill="FFFFFF"/>
+          </w:tcPr>
+          <w:p>
+            <w:pPr>
+              <w:spacing w:before="60" w:after="60"/>
+            </w:pPr>
+            <w:r/>
+            <w:r>
+              <w:rPr>
+                <w:rFonts w:ascii="Segoe UI" w:hAnsi="Segoe UI"/>
+                <w:b w:val="0"/>
+                <w:i w:val="0"/>
+                <w:color w:val="3A4A4C"/>
+                <w:sz w:val="18"/>
+              </w:rPr>
+              <w:t>34.5°</w:t>
+            </w:r>
+          </w:p>
+        </w:tc>
+        <w:tc>
+          <w:tcPr>
+            <w:tcW w:type="dxa" w:w="1863"/>
+            <w:shd w:val="clear" w:fill="DDEDEB"/>
+          </w:tcPr>
+          <w:p>
+            <w:pPr>
+              <w:spacing w:before="60" w:after="60"/>
+            </w:pPr>
+            <w:r/>
+            <w:r>
+              <w:rPr>
+                <w:rFonts w:ascii="Segoe UI" w:hAnsi="Segoe UI"/>
+                <w:b/>
+                <w:i w:val="0"/>
+                <w:color w:val="141C1E"/>
+                <w:sz w:val="18"/>
+              </w:rPr>
+              <w:t>41.9°</w:t>
+            </w:r>
+          </w:p>
+        </w:tc>
+        <w:tc>
+          <w:tcPr>
+            <w:tcW w:type="dxa" w:w="1863"/>
+            <w:shd w:val="clear" w:fill="FFFFFF"/>
+          </w:tcPr>
+          <w:p>
+            <w:pPr>
+              <w:spacing w:before="60" w:after="60"/>
+            </w:pPr>
+            <w:r/>
+            <w:r>
+              <w:rPr>
+                <w:rFonts w:ascii="Segoe UI" w:hAnsi="Segoe UI"/>
+                <w:b w:val="0"/>
+                <w:i w:val="0"/>
+                <w:color w:val="3A4A4C"/>
+                <w:sz w:val="18"/>
+              </w:rPr>
+              <w:t>37.6°</w:t>
+            </w:r>
+          </w:p>
+        </w:tc>
+      </w:tr>
+    </w:tbl>
+    <w:p>
+      <w:pPr>
+        <w:spacing w:after="80"/>
+      </w:pPr>
+    </w:p>
+    <w:p>
+      <w:r>
+        <w:rPr>
+          <w:rFonts w:ascii="Georgia" w:hAnsi="Georgia"/>
+          <w:b/>
+          <w:i w:val="0"/>
+          <w:color w:val="141C1E"/>
+          <w:sz w:val="21"/>
+        </w:rPr>
+        <w:t>The collapse is real and large.</w:t>
+      </w:r>
+      <w:r>
+        <w:rPr>
+          <w:rFonts w:ascii="Georgia" w:hAnsi="Georgia"/>
+          <w:b w:val="0"/>
+          <w:i w:val="0"/>
+          <w:color w:val="3A4A4C"/>
+          <w:sz w:val="21"/>
+        </w:rPr>
+        <w:t xml:space="preserve"> Grounding both ensembles contracts the angle from 35.7° to about 25°, nearly halving the margin the decision depends on — for every descriptor tested.</w:t>
+      </w:r>
+    </w:p>
+    <w:p>
+      <w:r>
+        <w:rPr>
+          <w:rFonts w:ascii="Georgia" w:hAnsi="Georgia"/>
+          <w:b/>
+          <w:i w:val="0"/>
+          <w:color w:val="141C1E"/>
+          <w:sz w:val="21"/>
+        </w:rPr>
+        <w:t>And the fix works geometrically.</w:t>
+      </w:r>
+      <w:r>
+        <w:rPr>
+          <w:rFonts w:ascii="Georgia" w:hAnsi="Georgia"/>
+          <w:b w:val="0"/>
+          <w:i w:val="0"/>
+          <w:color w:val="3A4A4C"/>
+          <w:sz w:val="21"/>
+        </w:rPr>
+        <w:t xml:space="preserve"> Grounding the normal ensemble alone causes no contraction. The matched descriptor actually </w:t>
+      </w:r>
+      <w:r>
+        <w:rPr>
+          <w:rFonts w:ascii="Georgia" w:hAnsi="Georgia"/>
+          <w:b w:val="0"/>
+          <w:i/>
+          <w:color w:val="3A4A4C"/>
+          <w:sz w:val="21"/>
+        </w:rPr>
+        <w:t>widens</w:t>
+      </w:r>
+      <w:r>
+        <w:rPr>
+          <w:rFonts w:ascii="Georgia" w:hAnsi="Georgia"/>
+          <w:b w:val="0"/>
+          <w:i w:val="0"/>
+          <w:color w:val="3A4A4C"/>
+          <w:sz w:val="21"/>
+        </w:rPr>
+        <w:t xml:space="preserve"> the angle to 41.9°, above the ungrounded baseline — and that condition has the best AUROC.</w:t>
+      </w:r>
+    </w:p>
+    <w:p>
+      <w:r>
+        <w:rPr>
+          <w:rFonts w:ascii="Georgia" w:hAnsi="Georgia"/>
+          <w:b/>
+          <w:i w:val="0"/>
+          <w:color w:val="141C1E"/>
+          <w:sz w:val="21"/>
+        </w:rPr>
+        <w:t>But one prediction failed.</w:t>
+      </w:r>
+      <w:r>
+        <w:rPr>
+          <w:rFonts w:ascii="Georgia" w:hAnsi="Georgia"/>
+          <w:b w:val="0"/>
+          <w:i w:val="0"/>
+          <w:color w:val="3A4A4C"/>
+          <w:sz w:val="21"/>
+        </w:rPr>
+        <w:t xml:space="preserve"> We expected the </w:t>
+      </w:r>
+      <w:r>
+        <w:rPr>
+          <w:rFonts w:ascii="Georgia" w:hAnsi="Georgia"/>
+          <w:b w:val="0"/>
+          <w:i/>
+          <w:color w:val="3A4A4C"/>
+          <w:sz w:val="21"/>
+        </w:rPr>
+        <w:t>accurate</w:t>
+      </w:r>
+      <w:r>
+        <w:rPr>
+          <w:rFonts w:ascii="Georgia" w:hAnsi="Georgia"/>
+          <w:b w:val="0"/>
+          <w:i w:val="0"/>
+          <w:color w:val="3A4A4C"/>
+          <w:sz w:val="21"/>
+        </w:rPr>
+        <w:t xml:space="preserve"> descriptor to collapse the prototypes furthest, since accurate text aligns with everything. It doesn't — mismatched collapses them marginally more. And the three grounded conditions sit within 1.3° of each other while their AUROC spans 0.029.</w:t>
+      </w:r>
+    </w:p>
+    <w:p>
+      <w:pPr>
+        <w:spacing w:before="120" w:after="120"/>
+        <w:ind w:left="317"/>
+        <w:pBdr>
+          <w:left w:val="single" w:sz="18" w:space="10" w:color="0D6B67"/>
+        </w:pBdr>
+      </w:pPr>
+      <w:r>
+        <w:rPr>
+          <w:rFonts w:ascii="Georgia" w:hAnsi="Georgia"/>
+          <w:b/>
+          <w:i w:val="0"/>
+          <w:color w:val="141C1E"/>
+          <w:sz w:val="21"/>
+        </w:rPr>
+        <w:t>So the account is incomplete, not confirmed.</w:t>
+      </w:r>
+      <w:r>
+        <w:rPr>
+          <w:rFonts w:ascii="Georgia" w:hAnsi="Georgia"/>
+          <w:b w:val="0"/>
+          <w:i w:val="0"/>
+          <w:color w:val="141C1E"/>
+          <w:sz w:val="21"/>
+        </w:rPr>
+        <w:t xml:space="preserve"> Prototype angle explains why grounding </w:t>
+      </w:r>
+      <w:r>
+        <w:rPr>
+          <w:rFonts w:ascii="Georgia" w:hAnsi="Georgia"/>
+          <w:b w:val="0"/>
+          <w:i/>
+          <w:color w:val="141C1E"/>
+          <w:sz w:val="21"/>
+        </w:rPr>
+        <w:t>both</w:t>
+      </w:r>
+      <w:r>
+        <w:rPr>
+          <w:rFonts w:ascii="Georgia" w:hAnsi="Georgia"/>
+          <w:b w:val="0"/>
+          <w:i w:val="0"/>
+          <w:color w:val="141C1E"/>
+          <w:sz w:val="21"/>
+        </w:rPr>
+        <w:t xml:space="preserve"> ensembles hurts. It does not explain why an accurate descriptor is the worst of the three. What's missing is the </w:t>
+      </w:r>
+      <w:r>
+        <w:rPr>
+          <w:rFonts w:ascii="Georgia" w:hAnsi="Georgia"/>
+          <w:b w:val="0"/>
+          <w:i/>
+          <w:color w:val="141C1E"/>
+          <w:sz w:val="21"/>
+        </w:rPr>
+        <w:t>direction</w:t>
+      </w:r>
+      <w:r>
+        <w:rPr>
+          <w:rFonts w:ascii="Georgia" w:hAnsi="Georgia"/>
+          <w:b w:val="0"/>
+          <w:i w:val="0"/>
+          <w:color w:val="141C1E"/>
+          <w:sz w:val="21"/>
+        </w:rPr>
+        <w:t xml:space="preserve"> of the collapse — toward the image distribution or away from it — and that hasn't been measured.</w:t>
+      </w:r>
+    </w:p>
+    <w:p>
+      <w:r>
+        <w:rPr>
+          <w:rFonts w:ascii="Georgia" w:hAnsi="Georgia"/>
+          <w:b w:val="0"/>
+          <w:i w:val="0"/>
+          <w:color w:val="3A4A4C"/>
+          <w:sz w:val="21"/>
+        </w:rPr>
+        <w:t>If asked, say exactly that. A mechanism that explains most of an effect and is honest about the remainder is stronger than one asserted to explain all of it.</w:t>
+      </w:r>
+    </w:p>
+    <w:p>
+      <w:pPr>
+        <w:keepNext/>
         <w:spacing w:before="320" w:after="120"/>
       </w:pPr>
       <w:r>
@@ -9872,7 +10442,7 @@
           <w:color w:val="141C1E"/>
           <w:sz w:val="21"/>
         </w:rPr>
-        <w:t>The dilution mechanism is inferred, not directly measured.</w:t>
+        <w:t>The *direction* of prototype collapse is not measured.</w:t>
       </w:r>
       <w:r>
         <w:rPr>
@@ -9882,7 +10452,7 @@
           <w:color w:val="3A4A4C"/>
           <w:sz w:val="21"/>
         </w:rPr>
-        <w:t xml:space="preserve"> The prototype</w:t>
+        <w:t xml:space="preserve"> The collapse</w:t>
       </w:r>
     </w:p>
     <w:p>
@@ -9894,7 +10464,27 @@
           <w:color w:val="3A4A4C"/>
           <w:sz w:val="21"/>
         </w:rPr>
-        <w:t>distance under each condition has never been computed. Takes minutes.</w:t>
+        <w:t xml:space="preserve">itself now is (§5.4a), but not whether it moves the prototypes toward or away from where the image embeddings sit — which is what would explain why an accurate descriptor is worse than a wrong one under </w:t>
+      </w:r>
+      <w:r>
+        <w:rPr>
+          <w:rFonts w:ascii="Consolas" w:hAnsi="Consolas"/>
+          <w:b w:val="0"/>
+          <w:i w:val="0"/>
+          <w:color w:val="3A4A4C"/>
+          <w:sz w:val="20"/>
+        </w:rPr>
+        <w:t>both</w:t>
+      </w:r>
+      <w:r>
+        <w:rPr>
+          <w:rFonts w:ascii="Georgia" w:hAnsi="Georgia"/>
+          <w:b w:val="0"/>
+          <w:i w:val="0"/>
+          <w:color w:val="3A4A4C"/>
+          <w:sz w:val="21"/>
+        </w:rPr>
+        <w:t xml:space="preserve"> fusion.</w:t>
       </w:r>
     </w:p>
     <w:p>

</xml_diff>